<commit_message>
Wzor_analizy: zgodnosc z instrukcja enova365 KP - licencje zlota/platynowa wg instrukcji, Pracownicy Eksportowi jako dodatek licencjonowany, import PUE (opcje, Harmonogram Zadan), aktualna lista nieobecnosci, powiadomienia, publikacja wyplat, zastepstwa, rezerwy (platyna); raport_zgodnosci_z_instrukcja.md
Co-Authored-By: Claude Opus 5.5 <noreply@anthropic.com>
Claude-Session: https://claude.ai/code/session_01MPv8DQFG5hE89BDXdF7Lue
</commit_message>
<xml_diff>
--- a/Wzor_analizy/Kwestionariusz_spotkan_KPCP.docx
+++ b/Wzor_analizy/Kwestionariusz_spotkan_KPCP.docx
@@ -5193,7 +5193,7 @@
               <w:pStyle w:val="Tekstabeli"/>
             </w:pPr>
             <w:r>
-              <w:t xml:space="preserve">Czy występują pracownicy oddelegowani za granicę lub cudzoziemcy z zezwoleniami na pracę? Kraje, liczba osób, waluta?</w:t>
+              <w:t xml:space="preserve">Czy występują pracownicy oddelegowani za granicę (dodatek licencjonowany Pracownicy Eksportowi) lub cudzoziemcy z zezwoleniami na pracę? Kraje, liczba osób, waluta?</w:t>
             </w:r>
           </w:p>
         </w:tc>
@@ -9592,7 +9592,7 @@
               <w:pStyle w:val="Tekstabeli"/>
             </w:pPr>
             <w:r>
-              <w:t xml:space="preserve">Import zwolnień z PUE: ręcznie czy automatycznie? Jaki wariant nadpisywania? Jaka nieobecność dla zwolnienia z tytułu opieki?</w:t>
+              <w:t xml:space="preserve">Import zwolnień z PUE: ręcznie czy automatycznie (wymaga Harmonogramu Zadań)? Jaki wariant edycji istniejących nieobecności (Nie edytuj / Tylko nierozliczone / Koryguj rozliczone i nierozliczone)? Jaka nieobecność dla zwolnienia z tytułu opieki?</w:t>
             </w:r>
           </w:p>
         </w:tc>

</xml_diff>

<commit_message>
Wzor analizy: nazwa wykonawcy AltOne (zamiast Alt One), regeneracja docx; sesja klienta B - korekta notatki D1
Co-Authored-By: Claude Opus 5.5 <noreply@anthropic.com>
Claude-Session: https://claude.ai/code/session_01HgSCx3RmK4bn4PK1BurMST
</commit_message>
<xml_diff>
--- a/Wzor_analizy/Kwestionariusz_spotkan_KPCP.docx
+++ b/Wzor_analizy/Kwestionariusz_spotkan_KPCP.docx
@@ -340,7 +340,7 @@
         <w:pStyle w:val="Klauzula"/>
       </w:pPr>
       <w:r>
-        <w:t xml:space="preserve">Dokument został opracowany przez Alt One wyłącznie dla </w:t>
+        <w:t xml:space="preserve">Dokument został opracowany przez AltOne wyłącznie dla </w:t>
       </w:r>
       <w:r>
         <w:rPr>
@@ -350,7 +350,7 @@
         <w:t xml:space="preserve">[DO UZUPEŁNIENIA: nazwa klienta]</w:t>
       </w:r>
       <w:r>
-        <w:t xml:space="preserve">. Nie może być reprodukowany, kopiowany lub publikowany w całości lub jakiejkolwiek jego części bez pisemnej zgody Alt One.</w:t>
+        <w:t xml:space="preserve">. Nie może być reprodukowany, kopiowany lub publikowany w całości lub jakiejkolwiek jego części bez pisemnej zgody AltOne.</w:t>
       </w:r>
     </w:p>
     <w:p>

</xml_diff>